<commit_message>
Did a little coding and writing
</commit_message>
<xml_diff>
--- a/assignment2/report/report.docx
+++ b/assignment2/report/report.docx
@@ -3,6 +3,9 @@
 <w:document xmlns:wpc="http://schemas.microsoft.com/office/word/2010/wordprocessingCanvas" xmlns:cx="http://schemas.microsoft.com/office/drawing/2014/chartex" xmlns:cx1="http://schemas.microsoft.com/office/drawing/2015/9/8/chartex" xmlns:cx2="http://schemas.microsoft.com/office/drawing/2015/10/21/chartex" xmlns:cx3="http://schemas.microsoft.com/office/drawing/2016/5/9/chartex" xmlns:cx4="http://schemas.microsoft.com/office/drawing/2016/5/10/chartex" xmlns:cx5="http://schemas.microsoft.com/office/drawing/2016/5/11/chartex" xmlns:cx6="http://schemas.microsoft.com/office/drawing/2016/5/12/chartex" xmlns:cx7="http://schemas.microsoft.com/office/drawing/2016/5/13/chartex" xmlns:cx8="http://schemas.microsoft.com/office/drawing/2016/5/14/chartex" xmlns:mc="http://schemas.openxmlformats.org/markup-compatibility/2006" xmlns:aink="http://schemas.microsoft.com/office/drawing/2016/ink" xmlns:am3d="http://schemas.microsoft.com/office/drawing/2017/model3d" xmlns:o="urn:schemas-microsoft-com:office:office" xmlns:oel="http://schemas.microsoft.com/office/2019/extlst" xmlns:r="http://schemas.openxmlformats.org/officeDocument/2006/relationships" xmlns:m="http://schemas.openxmlformats.org/officeDocument/2006/math" xmlns:v="urn:schemas-microsoft-com:vml" xmlns:wp14="http://schemas.microsoft.com/office/word/2010/wordprocessingDrawing" xmlns:wp="http://schemas.openxmlformats.org/drawingml/2006/wordprocessingDrawing" xmlns:w10="urn:schemas-microsoft-com:office:word" xmlns:w="http://schemas.openxmlformats.org/wordprocessingml/2006/main" xmlns:w14="http://schemas.microsoft.com/office/word/2010/wordml" xmlns:w15="http://schemas.microsoft.com/office/word/2012/wordml" xmlns:w16cex="http://schemas.microsoft.com/office/word/2018/wordml/cex" xmlns:w16cid="http://schemas.microsoft.com/office/word/2016/wordml/cid" xmlns:w16="http://schemas.microsoft.com/office/word/2018/wordml" xmlns:w16du="http://schemas.microsoft.com/office/word/2023/wordml/word16du" xmlns:w16sdtdh="http://schemas.microsoft.com/office/word/2020/wordml/sdtdatahash" xmlns:w16sdtfl="http://schemas.microsoft.com/office/word/2024/wordml/sdtformatlock" xmlns:w16se="http://schemas.microsoft.com/office/word/2015/wordml/symex" xmlns:wpg="http://schemas.microsoft.com/office/word/2010/wordprocessingGroup" xmlns:wpi="http://schemas.microsoft.com/office/word/2010/wordprocessingInk" xmlns:wne="http://schemas.microsoft.com/office/word/2006/wordml" xmlns:wps="http://schemas.microsoft.com/office/word/2010/wordprocessingShape" mc:Ignorable="w14 w15 w16se w16cid w16 w16cex w16sdtdh w16sdtfl w16du wp14">
   <w:body>
     <w:p>
+      <w:pPr>
+        <w:spacing w:line="480" w:lineRule="auto"/>
+      </w:pPr>
       <w:bookmarkStart w:id="0" w:name="_Hlk215337607"/>
       <w:bookmarkEnd w:id="0"/>
       <w:proofErr w:type="spellStart"/>
@@ -15,22 +18,41 @@
       </w:r>
     </w:p>
     <w:p>
+      <w:pPr>
+        <w:spacing w:line="480" w:lineRule="auto"/>
+      </w:pPr>
       <w:r>
         <w:t>Computer Science 311</w:t>
       </w:r>
     </w:p>
     <w:p>
+      <w:pPr>
+        <w:spacing w:line="480" w:lineRule="auto"/>
+      </w:pPr>
       <w:r>
         <w:t>February 2, 2026</w:t>
       </w:r>
     </w:p>
-    <w:p/>
-    <w:p>
-      <w:pPr>
+    <w:p>
+      <w:pPr>
+        <w:spacing w:line="480" w:lineRule="auto"/>
+      </w:pPr>
+    </w:p>
+    <w:p>
+      <w:pPr>
+        <w:spacing w:line="480" w:lineRule="auto"/>
         <w:jc w:val="center"/>
       </w:pPr>
       <w:r>
-        <w:t>Natural Gas Price Predict</w:t>
+        <w:t xml:space="preserve">Natural </w:t>
+      </w:r>
+      <w:proofErr w:type="gramStart"/>
+      <w:r>
+        <w:t>Gas Price</w:t>
+      </w:r>
+      <w:proofErr w:type="gramEnd"/>
+      <w:r>
+        <w:t xml:space="preserve"> Predict</w:t>
       </w:r>
       <w:r>
         <w:t>ion</w:t>
@@ -41,15 +63,22 @@
     </w:p>
     <w:p>
       <w:pPr>
+        <w:spacing w:line="480" w:lineRule="auto"/>
         <w:jc w:val="center"/>
       </w:pPr>
     </w:p>
     <w:p>
+      <w:pPr>
+        <w:spacing w:line="480" w:lineRule="auto"/>
+      </w:pPr>
       <w:r>
         <w:t>Introduction</w:t>
       </w:r>
     </w:p>
     <w:p>
+      <w:pPr>
+        <w:spacing w:line="480" w:lineRule="auto"/>
+      </w:pPr>
       <w:r>
         <w:tab/>
         <w:t>This project</w:t>
@@ -70,10 +99,10 @@
         <w:t xml:space="preserve"> </w:t>
       </w:r>
       <w:r>
-        <w:t>Provided</w:t>
-      </w:r>
-      <w:r>
-        <w:t xml:space="preserve"> with a </w:t>
+        <w:t xml:space="preserve">We start </w:t>
+      </w:r>
+      <w:r>
+        <w:t xml:space="preserve">with a </w:t>
       </w:r>
       <w:r>
         <w:t xml:space="preserve">training </w:t>
@@ -154,7 +183,13 @@
         <w:t>planners</w:t>
       </w:r>
       <w:r>
-        <w:t xml:space="preserve"> at least an idea to know what to expect. On the other hand, </w:t>
+        <w:t xml:space="preserve"> at least an idea </w:t>
+      </w:r>
+      <w:r>
+        <w:t>of</w:t>
+      </w:r>
+      <w:r>
+        <w:t xml:space="preserve"> what to expect. On the other hand, </w:t>
       </w:r>
       <w:r>
         <w:t xml:space="preserve">in the case of financial speculation being able to predict future prices would be the </w:t>
@@ -196,7 +231,10 @@
         <w:t xml:space="preserve"> In a logistics </w:t>
       </w:r>
       <w:r>
-        <w:t>use case</w:t>
+        <w:t xml:space="preserve">use </w:t>
+      </w:r>
+      <w:r>
+        <w:t>case,</w:t>
       </w:r>
       <w:r>
         <w:t xml:space="preserve"> </w:t>
@@ -238,13 +276,19 @@
         <w:t xml:space="preserve"> </w:t>
       </w:r>
     </w:p>
-    <w:p/>
-    <w:p>
-      <w:r>
+    <w:p>
+      <w:pPr>
+        <w:spacing w:line="480" w:lineRule="auto"/>
+      </w:pPr>
+      <w:r>
+        <w:lastRenderedPageBreak/>
         <w:t>Algorithms Used</w:t>
       </w:r>
     </w:p>
     <w:p>
+      <w:pPr>
+        <w:spacing w:line="480" w:lineRule="auto"/>
+      </w:pPr>
       <w:r>
         <w:tab/>
       </w:r>
@@ -405,11 +449,7 @@
         <w:t>contains</w:t>
       </w:r>
       <w:r>
-        <w:t xml:space="preserve"> relatively few features like was the case with </w:t>
-      </w:r>
-      <w:r>
-        <w:lastRenderedPageBreak/>
-        <w:t xml:space="preserve">the dataset used in this project. </w:t>
+        <w:t xml:space="preserve"> relatively few features like was the case with the dataset used in this project. </w:t>
       </w:r>
       <w:r>
         <w:t xml:space="preserve"> </w:t>
@@ -442,50 +482,50 @@
         <w:t>Forest,</w:t>
       </w:r>
       <w:r>
-        <w:t xml:space="preserve"> is a good call.</w:t>
-      </w:r>
-    </w:p>
-    <w:p/>
-    <w:p/>
-    <w:p/>
-    <w:p/>
-    <w:p/>
-    <w:p/>
-    <w:p/>
-    <w:p/>
-    <w:p/>
-    <w:p/>
-    <w:p/>
-    <w:p/>
-    <w:p/>
-    <w:p/>
-    <w:p/>
-    <w:p/>
-    <w:p/>
-    <w:p/>
-    <w:p/>
-    <w:p/>
-    <w:p/>
-    <w:p/>
-    <w:p/>
-    <w:p/>
-    <w:p>
-      <w:r>
-        <w:lastRenderedPageBreak/>
+        <w:t xml:space="preserve"> </w:t>
+      </w:r>
+      <w:proofErr w:type="gramStart"/>
+      <w:r>
+        <w:t>is</w:t>
+      </w:r>
+      <w:proofErr w:type="gramEnd"/>
+      <w:r>
+        <w:t xml:space="preserve"> a good call.</w:t>
+      </w:r>
+    </w:p>
+    <w:p>
+      <w:pPr>
+        <w:spacing w:line="480" w:lineRule="auto"/>
+      </w:pPr>
+    </w:p>
+    <w:p>
+      <w:pPr>
+        <w:spacing w:line="480" w:lineRule="auto"/>
+      </w:pPr>
+      <w:r>
         <w:t>Dataset Information</w:t>
       </w:r>
     </w:p>
     <w:p>
+      <w:pPr>
+        <w:spacing w:line="480" w:lineRule="auto"/>
+      </w:pPr>
       <w:r>
         <w:tab/>
       </w:r>
       <w:r>
-        <w:t xml:space="preserve">The dataset for this project was acquired </w:t>
+        <w:t xml:space="preserve">The dataset for this project was </w:t>
+      </w:r>
+      <w:r>
+        <w:t>acquired and</w:t>
+      </w:r>
+      <w:r>
+        <w:t xml:space="preserve"> </w:t>
       </w:r>
       <w:r>
         <w:t xml:space="preserve">downloaded from </w:t>
       </w:r>
-      <w:hyperlink r:id="rId5" w:history="1">
+      <w:hyperlink r:id="rId7" w:history="1">
         <w:r>
           <w:rPr>
             <w:rStyle w:val="Hyperlink"/>
@@ -521,7 +561,19 @@
         <w:t xml:space="preserve"> The dataset covered time between </w:t>
       </w:r>
       <w:r>
-        <w:t>January 7, 1997 through September 1, 2020</w:t>
+        <w:t xml:space="preserve">January 7, </w:t>
+      </w:r>
+      <w:proofErr w:type="gramStart"/>
+      <w:r>
+        <w:t>1997</w:t>
+      </w:r>
+      <w:proofErr w:type="gramEnd"/>
+      <w:r>
+        <w:t xml:space="preserve"> through September 1, </w:t>
+      </w:r>
+      <w:r>
+        <w:lastRenderedPageBreak/>
+        <w:t>2020</w:t>
       </w:r>
       <w:r>
         <w:t>.</w:t>
@@ -536,7 +588,7 @@
         <w:t xml:space="preserve">records in the dataset </w:t>
       </w:r>
       <w:r>
-        <w:t>corresponding</w:t>
+        <w:t>correspond</w:t>
       </w:r>
       <w:r>
         <w:t xml:space="preserve"> to the </w:t>
@@ -593,44 +645,571 @@
         <w:t xml:space="preserve">. </w:t>
       </w:r>
     </w:p>
-    <w:p/>
-    <w:p/>
-    <w:p/>
-    <w:p/>
-    <w:p/>
-    <w:p/>
-    <w:p/>
-    <w:p/>
-    <w:p/>
-    <w:p/>
-    <w:p/>
-    <w:p/>
-    <w:p/>
-    <w:p/>
-    <w:p/>
-    <w:p/>
-    <w:p/>
-    <w:p/>
-    <w:p/>
-    <w:p/>
-    <w:p/>
-    <w:p/>
-    <w:p/>
-    <w:p/>
-    <w:p/>
-    <w:p/>
-    <w:p/>
-    <w:p/>
-    <w:p/>
-    <w:p>
+    <w:tbl>
+      <w:tblPr>
+        <w:tblStyle w:val="TableGrid"/>
+        <w:tblW w:w="0" w:type="auto"/>
+        <w:tblLook w:val="04A0" w:firstRow="1" w:lastRow="0" w:firstColumn="1" w:lastColumn="0" w:noHBand="0" w:noVBand="1"/>
+      </w:tblPr>
+      <w:tblGrid>
+        <w:gridCol w:w="3116"/>
+        <w:gridCol w:w="3117"/>
+        <w:gridCol w:w="3117"/>
+      </w:tblGrid>
+      <w:tr>
+        <w:tc>
+          <w:tcPr>
+            <w:tcW w:w="3116" w:type="dxa"/>
+          </w:tcPr>
+          <w:p>
+            <w:pPr>
+              <w:spacing w:line="480" w:lineRule="auto"/>
+            </w:pPr>
+            <w:r>
+              <w:t>Name</w:t>
+            </w:r>
+          </w:p>
+        </w:tc>
+        <w:tc>
+          <w:tcPr>
+            <w:tcW w:w="3117" w:type="dxa"/>
+          </w:tcPr>
+          <w:p>
+            <w:pPr>
+              <w:spacing w:line="480" w:lineRule="auto"/>
+            </w:pPr>
+            <w:r>
+              <w:t>Description</w:t>
+            </w:r>
+          </w:p>
+        </w:tc>
+        <w:tc>
+          <w:tcPr>
+            <w:tcW w:w="3117" w:type="dxa"/>
+          </w:tcPr>
+          <w:p>
+            <w:pPr>
+              <w:spacing w:line="480" w:lineRule="auto"/>
+            </w:pPr>
+            <w:r>
+              <w:t>Data Type</w:t>
+            </w:r>
+          </w:p>
+        </w:tc>
+      </w:tr>
+      <w:tr>
+        <w:tc>
+          <w:tcPr>
+            <w:tcW w:w="3116" w:type="dxa"/>
+          </w:tcPr>
+          <w:p>
+            <w:pPr>
+              <w:spacing w:line="480" w:lineRule="auto"/>
+            </w:pPr>
+            <w:r>
+              <w:t>Price</w:t>
+            </w:r>
+          </w:p>
+        </w:tc>
+        <w:tc>
+          <w:tcPr>
+            <w:tcW w:w="3117" w:type="dxa"/>
+          </w:tcPr>
+          <w:p>
+            <w:pPr>
+              <w:spacing w:line="480" w:lineRule="auto"/>
+            </w:pPr>
+            <w:r>
+              <w:t>Today’s</w:t>
+            </w:r>
+            <w:r>
+              <w:t xml:space="preserve"> price</w:t>
+            </w:r>
+          </w:p>
+        </w:tc>
+        <w:tc>
+          <w:tcPr>
+            <w:tcW w:w="3117" w:type="dxa"/>
+          </w:tcPr>
+          <w:p>
+            <w:pPr>
+              <w:spacing w:line="480" w:lineRule="auto"/>
+            </w:pPr>
+            <w:r>
+              <w:t>Float</w:t>
+            </w:r>
+          </w:p>
+        </w:tc>
+      </w:tr>
+      <w:tr>
+        <w:tc>
+          <w:tcPr>
+            <w:tcW w:w="3116" w:type="dxa"/>
+          </w:tcPr>
+          <w:p>
+            <w:pPr>
+              <w:spacing w:line="480" w:lineRule="auto"/>
+            </w:pPr>
+            <w:r>
+              <w:t>Date</w:t>
+            </w:r>
+          </w:p>
+        </w:tc>
+        <w:tc>
+          <w:tcPr>
+            <w:tcW w:w="3117" w:type="dxa"/>
+          </w:tcPr>
+          <w:p>
+            <w:pPr>
+              <w:spacing w:line="480" w:lineRule="auto"/>
+            </w:pPr>
+            <w:r>
+              <w:t>Today’s</w:t>
+            </w:r>
+            <w:r>
+              <w:t xml:space="preserve"> date</w:t>
+            </w:r>
+          </w:p>
+        </w:tc>
+        <w:tc>
+          <w:tcPr>
+            <w:tcW w:w="3117" w:type="dxa"/>
+          </w:tcPr>
+          <w:p>
+            <w:pPr>
+              <w:spacing w:line="480" w:lineRule="auto"/>
+            </w:pPr>
+            <w:r>
+              <w:t>String</w:t>
+            </w:r>
+          </w:p>
+        </w:tc>
+      </w:tr>
+      <w:tr>
+        <w:tc>
+          <w:tcPr>
+            <w:tcW w:w="3116" w:type="dxa"/>
+          </w:tcPr>
+          <w:p>
+            <w:pPr>
+              <w:spacing w:line="480" w:lineRule="auto"/>
+            </w:pPr>
+            <w:r>
+              <w:t>Lag1</w:t>
+            </w:r>
+          </w:p>
+        </w:tc>
+        <w:tc>
+          <w:tcPr>
+            <w:tcW w:w="3117" w:type="dxa"/>
+          </w:tcPr>
+          <w:p>
+            <w:pPr>
+              <w:spacing w:line="480" w:lineRule="auto"/>
+            </w:pPr>
+            <w:r>
+              <w:t>Price from 1 day ago</w:t>
+            </w:r>
+          </w:p>
+        </w:tc>
+        <w:tc>
+          <w:tcPr>
+            <w:tcW w:w="3117" w:type="dxa"/>
+          </w:tcPr>
+          <w:p>
+            <w:pPr>
+              <w:spacing w:line="480" w:lineRule="auto"/>
+            </w:pPr>
+            <w:r>
+              <w:t>Float</w:t>
+            </w:r>
+          </w:p>
+        </w:tc>
+      </w:tr>
+      <w:tr>
+        <w:tc>
+          <w:tcPr>
+            <w:tcW w:w="3116" w:type="dxa"/>
+          </w:tcPr>
+          <w:p>
+            <w:pPr>
+              <w:spacing w:line="480" w:lineRule="auto"/>
+            </w:pPr>
+            <w:r>
+              <w:t>Lag2</w:t>
+            </w:r>
+          </w:p>
+        </w:tc>
+        <w:tc>
+          <w:tcPr>
+            <w:tcW w:w="3117" w:type="dxa"/>
+          </w:tcPr>
+          <w:p>
+            <w:pPr>
+              <w:spacing w:line="480" w:lineRule="auto"/>
+            </w:pPr>
+            <w:r>
+              <w:t>Price from 2 days ago</w:t>
+            </w:r>
+          </w:p>
+        </w:tc>
+        <w:tc>
+          <w:tcPr>
+            <w:tcW w:w="3117" w:type="dxa"/>
+          </w:tcPr>
+          <w:p>
+            <w:pPr>
+              <w:spacing w:line="480" w:lineRule="auto"/>
+            </w:pPr>
+            <w:r>
+              <w:t>Float</w:t>
+            </w:r>
+          </w:p>
+        </w:tc>
+      </w:tr>
+      <w:tr>
+        <w:tc>
+          <w:tcPr>
+            <w:tcW w:w="3116" w:type="dxa"/>
+          </w:tcPr>
+          <w:p>
+            <w:pPr>
+              <w:spacing w:line="480" w:lineRule="auto"/>
+            </w:pPr>
+            <w:r>
+              <w:t>Lag3</w:t>
+            </w:r>
+          </w:p>
+        </w:tc>
+        <w:tc>
+          <w:tcPr>
+            <w:tcW w:w="3117" w:type="dxa"/>
+          </w:tcPr>
+          <w:p>
+            <w:pPr>
+              <w:spacing w:line="480" w:lineRule="auto"/>
+            </w:pPr>
+            <w:r>
+              <w:t xml:space="preserve">Price from 3 days ago </w:t>
+            </w:r>
+          </w:p>
+        </w:tc>
+        <w:tc>
+          <w:tcPr>
+            <w:tcW w:w="3117" w:type="dxa"/>
+          </w:tcPr>
+          <w:p>
+            <w:pPr>
+              <w:spacing w:line="480" w:lineRule="auto"/>
+            </w:pPr>
+            <w:r>
+              <w:t>Float</w:t>
+            </w:r>
+          </w:p>
+        </w:tc>
+      </w:tr>
+      <w:tr>
+        <w:tc>
+          <w:tcPr>
+            <w:tcW w:w="3116" w:type="dxa"/>
+          </w:tcPr>
+          <w:p>
+            <w:pPr>
+              <w:spacing w:line="480" w:lineRule="auto"/>
+            </w:pPr>
+            <w:r>
+              <w:t>Lag4</w:t>
+            </w:r>
+          </w:p>
+        </w:tc>
+        <w:tc>
+          <w:tcPr>
+            <w:tcW w:w="3117" w:type="dxa"/>
+          </w:tcPr>
+          <w:p>
+            <w:pPr>
+              <w:spacing w:line="480" w:lineRule="auto"/>
+            </w:pPr>
+            <w:r>
+              <w:t xml:space="preserve">Price from 4 days ago </w:t>
+            </w:r>
+          </w:p>
+        </w:tc>
+        <w:tc>
+          <w:tcPr>
+            <w:tcW w:w="3117" w:type="dxa"/>
+          </w:tcPr>
+          <w:p>
+            <w:pPr>
+              <w:spacing w:line="480" w:lineRule="auto"/>
+            </w:pPr>
+            <w:r>
+              <w:t>Float</w:t>
+            </w:r>
+          </w:p>
+        </w:tc>
+      </w:tr>
+      <w:tr>
+        <w:tc>
+          <w:tcPr>
+            <w:tcW w:w="3116" w:type="dxa"/>
+          </w:tcPr>
+          <w:p>
+            <w:pPr>
+              <w:spacing w:line="480" w:lineRule="auto"/>
+            </w:pPr>
+            <w:r>
+              <w:t>Lag5</w:t>
+            </w:r>
+          </w:p>
+        </w:tc>
+        <w:tc>
+          <w:tcPr>
+            <w:tcW w:w="3117" w:type="dxa"/>
+          </w:tcPr>
+          <w:p>
+            <w:pPr>
+              <w:spacing w:line="480" w:lineRule="auto"/>
+            </w:pPr>
+            <w:r>
+              <w:t>Price from 5 days ago</w:t>
+            </w:r>
+          </w:p>
+        </w:tc>
+        <w:tc>
+          <w:tcPr>
+            <w:tcW w:w="3117" w:type="dxa"/>
+          </w:tcPr>
+          <w:p>
+            <w:pPr>
+              <w:spacing w:line="480" w:lineRule="auto"/>
+            </w:pPr>
+            <w:r>
+              <w:t>Float</w:t>
+            </w:r>
+          </w:p>
+        </w:tc>
+      </w:tr>
+      <w:tr>
+        <w:tc>
+          <w:tcPr>
+            <w:tcW w:w="3116" w:type="dxa"/>
+          </w:tcPr>
+          <w:p>
+            <w:pPr>
+              <w:spacing w:line="480" w:lineRule="auto"/>
+            </w:pPr>
+            <w:r>
+              <w:t>Lag6</w:t>
+            </w:r>
+          </w:p>
+        </w:tc>
+        <w:tc>
+          <w:tcPr>
+            <w:tcW w:w="3117" w:type="dxa"/>
+          </w:tcPr>
+          <w:p>
+            <w:pPr>
+              <w:spacing w:line="480" w:lineRule="auto"/>
+            </w:pPr>
+            <w:r>
+              <w:t>Price from 6 days ago</w:t>
+            </w:r>
+          </w:p>
+        </w:tc>
+        <w:tc>
+          <w:tcPr>
+            <w:tcW w:w="3117" w:type="dxa"/>
+          </w:tcPr>
+          <w:p>
+            <w:pPr>
+              <w:spacing w:line="480" w:lineRule="auto"/>
+            </w:pPr>
+            <w:r>
+              <w:t>Float</w:t>
+            </w:r>
+          </w:p>
+        </w:tc>
+      </w:tr>
+      <w:tr>
+        <w:tc>
+          <w:tcPr>
+            <w:tcW w:w="3116" w:type="dxa"/>
+          </w:tcPr>
+          <w:p>
+            <w:pPr>
+              <w:spacing w:line="480" w:lineRule="auto"/>
+            </w:pPr>
+            <w:r>
+              <w:t>Lag7</w:t>
+            </w:r>
+          </w:p>
+        </w:tc>
+        <w:tc>
+          <w:tcPr>
+            <w:tcW w:w="3117" w:type="dxa"/>
+          </w:tcPr>
+          <w:p>
+            <w:pPr>
+              <w:spacing w:line="480" w:lineRule="auto"/>
+            </w:pPr>
+            <w:r>
+              <w:t>Price from 7 days ago</w:t>
+            </w:r>
+          </w:p>
+        </w:tc>
+        <w:tc>
+          <w:tcPr>
+            <w:tcW w:w="3117" w:type="dxa"/>
+          </w:tcPr>
+          <w:p>
+            <w:pPr>
+              <w:spacing w:line="480" w:lineRule="auto"/>
+            </w:pPr>
+            <w:r>
+              <w:t>Float</w:t>
+            </w:r>
+          </w:p>
+        </w:tc>
+      </w:tr>
+    </w:tbl>
+    <w:p>
+      <w:pPr>
+        <w:spacing w:line="480" w:lineRule="auto"/>
+      </w:pPr>
+      <w:r>
+        <w:tab/>
+      </w:r>
+    </w:p>
+    <w:p>
+      <w:pPr>
+        <w:spacing w:line="480" w:lineRule="auto"/>
+        <w:ind w:firstLine="720"/>
+      </w:pPr>
+      <w:r>
+        <w:t xml:space="preserve">The data set being worked with in this project is </w:t>
+      </w:r>
+      <w:proofErr w:type="gramStart"/>
+      <w:r>
+        <w:t>pretty simple</w:t>
+      </w:r>
+      <w:proofErr w:type="gramEnd"/>
+      <w:r>
+        <w:t xml:space="preserve">. </w:t>
+      </w:r>
+      <w:r>
+        <w:t>Despite its simplicity it needs to be described in detail. The data CSV contains two</w:t>
+      </w:r>
+      <w:r>
+        <w:t xml:space="preserve"> columns containing the data. It is time series data so one column is the date and the other is the price. </w:t>
+      </w:r>
+      <w:r>
+        <w:t xml:space="preserve">The date column is a </w:t>
+      </w:r>
+      <w:proofErr w:type="gramStart"/>
+      <w:r>
+        <w:t>string</w:t>
+      </w:r>
+      <w:proofErr w:type="gramEnd"/>
+      <w:r>
+        <w:t xml:space="preserve"> </w:t>
+      </w:r>
+      <w:r>
+        <w:t xml:space="preserve">and the price is a </w:t>
+      </w:r>
+      <w:proofErr w:type="gramStart"/>
+      <w:r>
+        <w:t>flo</w:t>
+      </w:r>
+      <w:r>
+        <w:t>ating</w:t>
+      </w:r>
+      <w:r>
+        <w:t xml:space="preserve"> point</w:t>
+      </w:r>
+      <w:proofErr w:type="gramEnd"/>
+      <w:r>
+        <w:t xml:space="preserve"> number. The date could be switched to date time data type if needed. </w:t>
+      </w:r>
+      <w:r>
+        <w:t>The price flo</w:t>
+      </w:r>
+      <w:r>
+        <w:t>a</w:t>
+      </w:r>
+      <w:r>
+        <w:t xml:space="preserve">ting point represents the per </w:t>
+      </w:r>
+      <w:r>
+        <w:t xml:space="preserve">unit price of gas on the </w:t>
+      </w:r>
+      <w:r>
+        <w:lastRenderedPageBreak/>
+        <w:t xml:space="preserve">corresponding date. The data set is simple but suitable for this project. </w:t>
+      </w:r>
+      <w:r>
+        <w:t xml:space="preserve">The engineered features of the project are very important </w:t>
+      </w:r>
+      <w:proofErr w:type="gramStart"/>
+      <w:r>
+        <w:t>due to the fact that</w:t>
+      </w:r>
+      <w:proofErr w:type="gramEnd"/>
+      <w:r>
+        <w:t xml:space="preserve"> we only have one </w:t>
+      </w:r>
+      <w:r>
+        <w:t xml:space="preserve">column that is numeric. The fundamental logic behind </w:t>
+      </w:r>
+      <w:r>
+        <w:t xml:space="preserve">the training of this module is that the price history contains data about how the price will perform in the future. Compounding this </w:t>
+      </w:r>
+      <w:r>
+        <w:t xml:space="preserve">trend into the model is the </w:t>
+      </w:r>
+      <w:proofErr w:type="gramStart"/>
+      <w:r>
+        <w:t>ultimate goal</w:t>
+      </w:r>
+      <w:proofErr w:type="gramEnd"/>
+      <w:r>
+        <w:t xml:space="preserve">. </w:t>
+      </w:r>
+    </w:p>
+    <w:p>
+      <w:pPr>
+        <w:spacing w:line="480" w:lineRule="auto"/>
+      </w:pPr>
+    </w:p>
+    <w:p>
+      <w:pPr>
+        <w:spacing w:line="480" w:lineRule="auto"/>
+      </w:pPr>
       <w:r>
         <w:t xml:space="preserve">Tools and Libraries </w:t>
       </w:r>
     </w:p>
     <w:p>
+      <w:pPr>
+        <w:spacing w:line="480" w:lineRule="auto"/>
+      </w:pPr>
       <w:r>
         <w:tab/>
-        <w:t>This project only uses three tools that are outside of pythons built in tools. Python projects tend to stack up the dependencies but this project is able to get it done with just three.</w:t>
+        <w:t xml:space="preserve">This project only uses three tools that are outside of pythons built in tools. Python projects tend to stack up the </w:t>
+      </w:r>
+      <w:r>
+        <w:t>dependencies,</w:t>
+      </w:r>
+      <w:r>
+        <w:t xml:space="preserve"> but this project </w:t>
+      </w:r>
+      <w:proofErr w:type="gramStart"/>
+      <w:r>
+        <w:t>is able to</w:t>
+      </w:r>
+      <w:proofErr w:type="gramEnd"/>
+      <w:r>
+        <w:t xml:space="preserve"> get it done with just three.</w:t>
       </w:r>
     </w:p>
     <w:p>
@@ -639,6 +1218,7 @@
           <w:ilvl w:val="0"/>
           <w:numId w:val="10"/>
         </w:numPr>
+        <w:spacing w:line="480" w:lineRule="auto"/>
       </w:pPr>
       <w:r>
         <w:t>Pandas</w:t>
@@ -650,6 +1230,7 @@
           <w:ilvl w:val="0"/>
           <w:numId w:val="10"/>
         </w:numPr>
+        <w:spacing w:line="480" w:lineRule="auto"/>
       </w:pPr>
       <w:r>
         <w:t xml:space="preserve">matplotlib </w:t>
@@ -661,6 +1242,7 @@
           <w:ilvl w:val="0"/>
           <w:numId w:val="10"/>
         </w:numPr>
+        <w:spacing w:line="480" w:lineRule="auto"/>
       </w:pPr>
       <w:r>
         <w:t>scikit-learn</w:t>
@@ -668,16 +1250,33 @@
     </w:p>
     <w:p>
       <w:pPr>
+        <w:spacing w:line="480" w:lineRule="auto"/>
         <w:ind w:firstLine="720"/>
       </w:pPr>
       <w:r>
         <w:t>Pandas</w:t>
       </w:r>
       <w:r>
-        <w:t xml:space="preserve"> is a data handling library the</w:t>
-      </w:r>
-      <w:r>
-        <w:t xml:space="preserve"> that allows programs to move data sets from file into memory in what are called data frames. Commonly abbreviated as </w:t>
+        <w:t xml:space="preserve"> is a data handling library </w:t>
+      </w:r>
+      <w:proofErr w:type="gramStart"/>
+      <w:r>
+        <w:t>the</w:t>
+      </w:r>
+      <w:r>
+        <w:t xml:space="preserve"> that</w:t>
+      </w:r>
+      <w:proofErr w:type="gramEnd"/>
+      <w:r>
+        <w:t xml:space="preserve"> allows programs to move data sets from </w:t>
+      </w:r>
+      <w:proofErr w:type="gramStart"/>
+      <w:r>
+        <w:t>file</w:t>
+      </w:r>
+      <w:proofErr w:type="gramEnd"/>
+      <w:r>
+        <w:t xml:space="preserve"> into memory in what are called data frames. Commonly abbreviated as </w:t>
       </w:r>
       <w:proofErr w:type="spellStart"/>
       <w:r>
@@ -688,7 +1287,7 @@
         <w:t xml:space="preserve">. </w:t>
       </w:r>
       <w:r>
-        <w:t xml:space="preserve">It is incredibly powerful and is used for meany </w:t>
+        <w:t xml:space="preserve">It is incredibly powerful and is used for many </w:t>
       </w:r>
       <w:r>
         <w:t>machine leaning and data analytics tasks.</w:t>
@@ -696,6 +1295,7 @@
     </w:p>
     <w:p>
       <w:pPr>
+        <w:spacing w:line="480" w:lineRule="auto"/>
         <w:ind w:firstLine="720"/>
       </w:pPr>
       <w:r>
@@ -717,7 +1317,15 @@
         <w:t xml:space="preserve"> Although there are better and more contemporary libraries that can do the same thing </w:t>
       </w:r>
       <w:r>
-        <w:t xml:space="preserve">with better charts Matplotlib is definitely the industry standard. </w:t>
+        <w:t xml:space="preserve">with better charts Matplotlib is </w:t>
+      </w:r>
+      <w:proofErr w:type="gramStart"/>
+      <w:r>
+        <w:t>definitely the</w:t>
+      </w:r>
+      <w:proofErr w:type="gramEnd"/>
+      <w:r>
+        <w:t xml:space="preserve"> industry standard. </w:t>
       </w:r>
       <w:r>
         <w:t xml:space="preserve"> </w:t>
@@ -725,9 +1333,11 @@
     </w:p>
     <w:p>
       <w:pPr>
+        <w:spacing w:line="480" w:lineRule="auto"/>
         <w:ind w:firstLine="720"/>
       </w:pPr>
       <w:r>
+        <w:lastRenderedPageBreak/>
         <w:t>S</w:t>
       </w:r>
       <w:r>
@@ -767,7 +1377,15 @@
         <w:t>library</w:t>
       </w:r>
       <w:r>
-        <w:t xml:space="preserve"> abstracts so much and put powerful algorithms </w:t>
+        <w:t xml:space="preserve"> abstracts so much and </w:t>
+      </w:r>
+      <w:proofErr w:type="gramStart"/>
+      <w:r>
+        <w:t>put</w:t>
+      </w:r>
+      <w:proofErr w:type="gramEnd"/>
+      <w:r>
+        <w:t xml:space="preserve"> powerful algorithms </w:t>
       </w:r>
       <w:r>
         <w:t>at your disposal with a few simple lines of code.</w:t>
@@ -775,29 +1393,399 @@
     </w:p>
     <w:p>
       <w:pPr>
-        <w:ind w:firstLine="720"/>
-      </w:pPr>
-    </w:p>
-    <w:p/>
-    <w:p>
+        <w:spacing w:line="480" w:lineRule="auto"/>
+      </w:pPr>
       <w:r>
         <w:t>Design and Implementation</w:t>
       </w:r>
     </w:p>
     <w:p>
+      <w:pPr>
+        <w:spacing w:line="480" w:lineRule="auto"/>
+      </w:pPr>
       <w:r>
         <w:tab/>
         <w:t>The design implementation of this program is sleek and follows a logical flow to handle the information.</w:t>
       </w:r>
       <w:r>
-        <w:t xml:space="preserve"> The philosophy used in programing it was to keep thing minimal and directly to the point with no frills to it while still doing everything </w:t>
+        <w:t xml:space="preserve"> The philosophy used in </w:t>
+      </w:r>
+      <w:r>
+        <w:t>programming</w:t>
+      </w:r>
+      <w:r>
+        <w:t xml:space="preserve"> was to keep </w:t>
+      </w:r>
+      <w:proofErr w:type="gramStart"/>
+      <w:r>
+        <w:t>th</w:t>
+      </w:r>
+      <w:r>
+        <w:t>ing</w:t>
+      </w:r>
+      <w:proofErr w:type="gramEnd"/>
+      <w:r>
+        <w:t xml:space="preserve"> minimal</w:t>
+      </w:r>
+      <w:r>
+        <w:t xml:space="preserve"> and directly to the point with no frills to </w:t>
+      </w:r>
+      <w:proofErr w:type="gramStart"/>
+      <w:r>
+        <w:t>it</w:t>
+      </w:r>
+      <w:proofErr w:type="gramEnd"/>
+      <w:r>
+        <w:t xml:space="preserve"> while still doing everything </w:t>
       </w:r>
       <w:r>
         <w:t xml:space="preserve">required well. </w:t>
       </w:r>
-    </w:p>
-    <w:p/>
-    <w:p>
+      <w:r>
+        <w:t xml:space="preserve"> </w:t>
+      </w:r>
+      <w:r>
+        <w:t xml:space="preserve">The flow of data is intended to be from a CSV file containing price data of </w:t>
+      </w:r>
+      <w:r>
+        <w:t>natural</w:t>
+      </w:r>
+      <w:r>
+        <w:t xml:space="preserve"> gas</w:t>
+      </w:r>
+      <w:r>
+        <w:t xml:space="preserve"> through to a trained model with the capability to predict the future price of natural gas</w:t>
+      </w:r>
+      <w:r>
+        <w:t>.</w:t>
+      </w:r>
+      <w:r>
+        <w:t xml:space="preserve"> The first step is to use Pandas to load the data into </w:t>
+      </w:r>
+      <w:r>
+        <w:t xml:space="preserve">a </w:t>
+      </w:r>
+      <w:r>
+        <w:t>data f</w:t>
+      </w:r>
+      <w:r>
+        <w:t xml:space="preserve">rame and assign the column that is supposed to be predicted. </w:t>
+      </w:r>
+      <w:r>
+        <w:t xml:space="preserve">The script uses a simple loop to look for the correct column for the prediction. It searches for the price and </w:t>
+      </w:r>
+      <w:r>
+        <w:t xml:space="preserve">close </w:t>
+      </w:r>
+      <w:r>
+        <w:t>keywords.</w:t>
+      </w:r>
+      <w:r>
+        <w:t xml:space="preserve"> At this point the informa</w:t>
+      </w:r>
+      <w:r>
+        <w:t xml:space="preserve">tion about the dataset is printed </w:t>
+      </w:r>
+      <w:proofErr w:type="gramStart"/>
+      <w:r>
+        <w:t>to</w:t>
+      </w:r>
+      <w:proofErr w:type="gramEnd"/>
+      <w:r>
+        <w:t xml:space="preserve"> the terminal. This helps to </w:t>
+      </w:r>
+      <w:r>
+        <w:t>ensure</w:t>
+      </w:r>
+      <w:r>
+        <w:t xml:space="preserve"> the data is loaded properly and nothing has gone wrong. </w:t>
+      </w:r>
+      <w:r>
+        <w:t>Potential</w:t>
+      </w:r>
+      <w:r>
+        <w:t xml:space="preserve"> problems would be a problem with opening the file or permissions or it could be a problem with the data </w:t>
+      </w:r>
+      <w:r>
+        <w:t>itself</w:t>
+      </w:r>
+      <w:r>
+        <w:t xml:space="preserve"> </w:t>
+      </w:r>
+      <w:r>
+        <w:t xml:space="preserve">being corrupted or incompatible with the script. </w:t>
+      </w:r>
+      <w:r>
+        <w:t xml:space="preserve">If something goes </w:t>
+      </w:r>
+      <w:r>
+        <w:t>wrong,</w:t>
+      </w:r>
+      <w:r>
+        <w:t xml:space="preserve"> giving the user feedback is quite valuable. </w:t>
+      </w:r>
+      <w:r>
+        <w:t xml:space="preserve">Now the program turns to working on the model itself. To begin with the engineered features. They consist of a </w:t>
+      </w:r>
+      <w:r>
+        <w:t xml:space="preserve">lag of seven days. This is done by creating a matrix </w:t>
+      </w:r>
+      <w:r>
+        <w:t>where</w:t>
+      </w:r>
+      <w:r>
+        <w:t xml:space="preserve"> each row is </w:t>
+      </w:r>
+      <w:r>
+        <w:t xml:space="preserve">a </w:t>
+      </w:r>
+      <w:r>
+        <w:t>day’s</w:t>
+      </w:r>
+      <w:r>
+        <w:t xml:space="preserve"> price covering the last seven days. </w:t>
+      </w:r>
+      <w:r>
+        <w:t xml:space="preserve">These prices are paired with the current </w:t>
+      </w:r>
+      <w:r>
+        <w:t>day’s</w:t>
+      </w:r>
+      <w:r>
+        <w:t xml:space="preserve"> price. </w:t>
+      </w:r>
+      <w:r>
+        <w:t xml:space="preserve">If any rows are </w:t>
+      </w:r>
+      <w:r>
+        <w:t>shifted,</w:t>
+      </w:r>
+      <w:r>
+        <w:t xml:space="preserve"> they are removed to which will keep the training data clean. </w:t>
+      </w:r>
+      <w:r>
+        <w:t xml:space="preserve">Given that the data itself is </w:t>
+      </w:r>
+      <w:r>
+        <w:t xml:space="preserve">in order </w:t>
+      </w:r>
+      <w:r>
+        <w:t>because of</w:t>
+      </w:r>
+      <w:r>
+        <w:t xml:space="preserve"> its time series data the training data is split based on time and not randomly. </w:t>
+      </w:r>
+      <w:r>
+        <w:t xml:space="preserve">The training testing split is the standard eighty twenty </w:t>
+      </w:r>
+      <w:r>
+        <w:lastRenderedPageBreak/>
+        <w:t xml:space="preserve">split. </w:t>
+      </w:r>
+      <w:r>
+        <w:t xml:space="preserve">With this split the model is trained on the first eighty </w:t>
+      </w:r>
+      <w:proofErr w:type="gramStart"/>
+      <w:r>
+        <w:t>percent</w:t>
+      </w:r>
+      <w:proofErr w:type="gramEnd"/>
+      <w:r>
+        <w:t xml:space="preserve"> then the trained model is tested on the remaining twenty percent to </w:t>
+      </w:r>
+      <w:proofErr w:type="gramStart"/>
+      <w:r>
+        <w:t>insure</w:t>
+      </w:r>
+      <w:proofErr w:type="gramEnd"/>
+      <w:r>
+        <w:t xml:space="preserve"> it </w:t>
+      </w:r>
+      <w:proofErr w:type="gramStart"/>
+      <w:r>
+        <w:t>actually</w:t>
+      </w:r>
+      <w:r>
+        <w:t xml:space="preserve"> has</w:t>
+      </w:r>
+      <w:proofErr w:type="gramEnd"/>
+      <w:r>
+        <w:t xml:space="preserve"> prediction power. </w:t>
+      </w:r>
+      <w:r>
+        <w:t xml:space="preserve">Now that the data is divided up it is passed to the training algorithm itself. In this case it is </w:t>
+      </w:r>
+      <w:proofErr w:type="gramStart"/>
+      <w:r>
+        <w:t>a Random</w:t>
+      </w:r>
+      <w:proofErr w:type="gramEnd"/>
+      <w:r>
+        <w:t xml:space="preserve"> Forest Regressor that contains two hundred trees. </w:t>
+      </w:r>
+      <w:r>
+        <w:t xml:space="preserve">The training is </w:t>
+      </w:r>
+      <w:proofErr w:type="gramStart"/>
+      <w:r>
+        <w:t>preformed</w:t>
+      </w:r>
+      <w:proofErr w:type="gramEnd"/>
+      <w:r>
+        <w:t xml:space="preserve"> with the lag feature. </w:t>
+      </w:r>
+      <w:r>
+        <w:t xml:space="preserve">The model is then evaluated against the test data. For the last </w:t>
+      </w:r>
+      <w:proofErr w:type="gramStart"/>
+      <w:r>
+        <w:t>two part</w:t>
+      </w:r>
+      <w:proofErr w:type="gramEnd"/>
+      <w:r>
+        <w:t xml:space="preserve"> step the scrip</w:t>
+      </w:r>
+      <w:r>
+        <w:t>t</w:t>
+      </w:r>
+      <w:r>
+        <w:t xml:space="preserve"> prints the </w:t>
+      </w:r>
+      <w:r>
+        <w:t xml:space="preserve">prediction for the price of </w:t>
+      </w:r>
+      <w:r>
+        <w:t>natural</w:t>
+      </w:r>
+      <w:r>
+        <w:t xml:space="preserve"> gas on the day f</w:t>
+      </w:r>
+      <w:r>
+        <w:t>ollowing</w:t>
+      </w:r>
+      <w:r>
+        <w:t xml:space="preserve"> the end of the data set and a chart depicting the actual price and the predicted price. </w:t>
+      </w:r>
+      <w:r>
+        <w:t xml:space="preserve"> </w:t>
+      </w:r>
+      <w:proofErr w:type="gramStart"/>
+      <w:r>
+        <w:t>The tomorrow</w:t>
+      </w:r>
+      <w:proofErr w:type="gramEnd"/>
+      <w:r>
+        <w:t xml:space="preserve"> prediction is made using the lag feature to give a predicted price. The chat is created using the Mat</w:t>
+      </w:r>
+      <w:r>
+        <w:t xml:space="preserve">plotlib library. It is always crazy seeing how much can be done with just a few lines of code when taking advantage of powerful tools like this library. </w:t>
+      </w:r>
+      <w:r>
+        <w:t>The c</w:t>
+      </w:r>
+      <w:r>
+        <w:t>h</w:t>
+      </w:r>
+      <w:r>
+        <w:t>art real</w:t>
+      </w:r>
+      <w:r>
+        <w:t>l</w:t>
+      </w:r>
+      <w:r>
+        <w:t xml:space="preserve">y gives a lot more context than simply printing numbers to the terminal. </w:t>
+      </w:r>
+      <w:r>
+        <w:t>Overall,</w:t>
+      </w:r>
+      <w:r>
+        <w:t xml:space="preserve"> the scrip</w:t>
+      </w:r>
+      <w:r>
+        <w:t>t</w:t>
+      </w:r>
+      <w:r>
+        <w:t xml:space="preserve"> ends up being like fifty lines of code and still </w:t>
+      </w:r>
+      <w:proofErr w:type="gramStart"/>
+      <w:r>
+        <w:t>is able to</w:t>
+      </w:r>
+      <w:proofErr w:type="gramEnd"/>
+      <w:r>
+        <w:t xml:space="preserve"> get the needed work done. </w:t>
+      </w:r>
+      <w:proofErr w:type="gramStart"/>
+      <w:r>
+        <w:t>In particular scikit-lea</w:t>
+      </w:r>
+      <w:r>
+        <w:t>r</w:t>
+      </w:r>
+      <w:r>
+        <w:t>n</w:t>
+      </w:r>
+      <w:proofErr w:type="gramEnd"/>
+      <w:r>
+        <w:t xml:space="preserve"> abstracts away a lot of the complexity </w:t>
+      </w:r>
+      <w:r>
+        <w:t>of the machine lea</w:t>
+      </w:r>
+      <w:r>
+        <w:t>r</w:t>
+      </w:r>
+      <w:r>
+        <w:t xml:space="preserve">ning algorithms that can be encountered with cutting edge libraries like </w:t>
+      </w:r>
+      <w:proofErr w:type="spellStart"/>
+      <w:r>
+        <w:t>PyT</w:t>
+      </w:r>
+      <w:r>
+        <w:t>orch</w:t>
+      </w:r>
+      <w:proofErr w:type="spellEnd"/>
+      <w:r>
+        <w:t>.</w:t>
+      </w:r>
+      <w:r>
+        <w:t xml:space="preserve"> </w:t>
+      </w:r>
+      <w:r>
+        <w:t xml:space="preserve">It is </w:t>
+      </w:r>
+      <w:r>
+        <w:t>really</w:t>
+      </w:r>
+      <w:r>
+        <w:t xml:space="preserve"> empowering to be able to access machine learning algorithms with only a </w:t>
+      </w:r>
+      <w:r>
+        <w:t>few</w:t>
+      </w:r>
+      <w:r>
+        <w:t xml:space="preserve"> lines of code</w:t>
+      </w:r>
+      <w:r>
+        <w:t>. This is the power of Python and select libraries when handling data and machine lea</w:t>
+      </w:r>
+      <w:r>
+        <w:t>r</w:t>
+      </w:r>
+      <w:r>
+        <w:t>ning.</w:t>
+      </w:r>
+    </w:p>
+    <w:p>
+      <w:pPr>
+        <w:spacing w:line="480" w:lineRule="auto"/>
+      </w:pPr>
+    </w:p>
+    <w:p>
+      <w:pPr>
+        <w:spacing w:line="480" w:lineRule="auto"/>
+      </w:pPr>
       <w:r>
         <w:t>Running</w:t>
       </w:r>
@@ -806,9 +1794,20 @@
       </w:r>
     </w:p>
     <w:p>
+      <w:pPr>
+        <w:spacing w:line="480" w:lineRule="auto"/>
+      </w:pPr>
       <w:r>
         <w:tab/>
-        <w:t xml:space="preserve">Running the app is pretty straightforward. </w:t>
+        <w:t xml:space="preserve">Running the app is </w:t>
+      </w:r>
+      <w:proofErr w:type="gramStart"/>
+      <w:r>
+        <w:t>pretty straightforward</w:t>
+      </w:r>
+      <w:proofErr w:type="gramEnd"/>
+      <w:r>
+        <w:t xml:space="preserve">. </w:t>
       </w:r>
       <w:r>
         <w:t xml:space="preserve">First navigate to the projects GitHub </w:t>
@@ -837,8 +1836,10 @@
           <w:ilvl w:val="0"/>
           <w:numId w:val="10"/>
         </w:numPr>
-      </w:pPr>
-      <w:r>
+        <w:spacing w:line="480" w:lineRule="auto"/>
+      </w:pPr>
+      <w:r>
+        <w:lastRenderedPageBreak/>
         <w:t>Pandas</w:t>
       </w:r>
     </w:p>
@@ -848,6 +1849,7 @@
           <w:ilvl w:val="0"/>
           <w:numId w:val="10"/>
         </w:numPr>
+        <w:spacing w:line="480" w:lineRule="auto"/>
       </w:pPr>
       <w:r>
         <w:t xml:space="preserve">matplotlib </w:t>
@@ -859,12 +1861,16 @@
           <w:ilvl w:val="0"/>
           <w:numId w:val="10"/>
         </w:numPr>
+        <w:spacing w:line="480" w:lineRule="auto"/>
       </w:pPr>
       <w:r>
         <w:t>scikit-learn</w:t>
       </w:r>
     </w:p>
     <w:p>
+      <w:pPr>
+        <w:spacing w:line="480" w:lineRule="auto"/>
+      </w:pPr>
       <w:r>
         <w:t xml:space="preserve">These can be </w:t>
       </w:r>
@@ -886,11 +1892,16 @@
       <w:r>
         <w:t xml:space="preserve"> The data set is </w:t>
       </w:r>
+      <w:proofErr w:type="gramStart"/>
       <w:r>
         <w:t>fairly</w:t>
       </w:r>
       <w:r>
-        <w:t xml:space="preserve"> small so it was not added to the git ignore and will </w:t>
+        <w:t xml:space="preserve"> small</w:t>
+      </w:r>
+      <w:proofErr w:type="gramEnd"/>
+      <w:r>
+        <w:t xml:space="preserve"> so it was not added to the git ignore and will </w:t>
       </w:r>
       <w:r>
         <w:t>therefore</w:t>
@@ -902,8 +1913,19 @@
         <w:t>acquired</w:t>
       </w:r>
       <w:r>
-        <w:t xml:space="preserve"> from Kegel</w:t>
-      </w:r>
+        <w:t xml:space="preserve"> from </w:t>
+      </w:r>
+      <w:proofErr w:type="spellStart"/>
+      <w:r>
+        <w:t>Keg</w:t>
+      </w:r>
+      <w:r>
+        <w:t>g</w:t>
+      </w:r>
+      <w:r>
+        <w:t>el</w:t>
+      </w:r>
+      <w:proofErr w:type="spellEnd"/>
       <w:r>
         <w:t xml:space="preserve">. Once the </w:t>
       </w:r>
@@ -932,13 +1954,25 @@
         <w:t>RMSE</w:t>
       </w:r>
       <w:r>
-        <w:t xml:space="preserve">. The next days </w:t>
+        <w:t xml:space="preserve">. The next </w:t>
+      </w:r>
+      <w:r>
+        <w:t>day’s</w:t>
+      </w:r>
+      <w:r>
+        <w:t xml:space="preserve"> </w:t>
       </w:r>
       <w:r>
         <w:t>prediction</w:t>
       </w:r>
       <w:r>
-        <w:t xml:space="preserve"> will be then be displayed. Lastly matpl</w:t>
+        <w:t xml:space="preserve"> </w:t>
+      </w:r>
+      <w:r>
+        <w:t>will then be</w:t>
+      </w:r>
+      <w:r>
+        <w:t xml:space="preserve"> displayed. Lastly matpl</w:t>
       </w:r>
       <w:r>
         <w:t>o</w:t>
@@ -947,22 +1981,35 @@
         <w:t xml:space="preserve">tlib will </w:t>
       </w:r>
       <w:r>
-        <w:t>display a char showing the predicted price compared to the actual price.</w:t>
-      </w:r>
-    </w:p>
-    <w:p>
+        <w:t xml:space="preserve">display a </w:t>
+      </w:r>
+      <w:r>
+        <w:t>chart</w:t>
+      </w:r>
+      <w:r>
+        <w:t xml:space="preserve"> showing the predicted price compared to the actual price.</w:t>
+      </w:r>
+    </w:p>
+    <w:p>
+      <w:pPr>
+        <w:spacing w:line="480" w:lineRule="auto"/>
+      </w:pPr>
       <w:r>
         <w:t xml:space="preserve"> </w:t>
       </w:r>
     </w:p>
-    <w:p/>
-    <w:p/>
-    <w:p>
+    <w:p>
+      <w:pPr>
+        <w:spacing w:line="480" w:lineRule="auto"/>
+      </w:pPr>
       <w:r>
         <w:t xml:space="preserve">Results </w:t>
       </w:r>
     </w:p>
     <w:p>
+      <w:pPr>
+        <w:spacing w:line="480" w:lineRule="auto"/>
+      </w:pPr>
       <w:r>
         <w:tab/>
       </w:r>
@@ -988,7 +2035,13 @@
         <w:t>The graph has colors and compares the two.</w:t>
       </w:r>
       <w:r>
-        <w:t xml:space="preserve"> There is some statistics about the data set including </w:t>
+        <w:t xml:space="preserve"> There </w:t>
+      </w:r>
+      <w:r>
+        <w:t>are</w:t>
+      </w:r>
+      <w:r>
+        <w:t xml:space="preserve"> some statistics about the data set including </w:t>
       </w:r>
       <w:r>
         <w:t>mean, standard deviation, minimum and quartiles.</w:t>
@@ -1000,17 +2053,29 @@
         <w:t>ensure</w:t>
       </w:r>
       <w:r>
-        <w:t xml:space="preserve"> the data loaded correctly and the model was able to </w:t>
+        <w:t xml:space="preserve"> the data </w:t>
+      </w:r>
+      <w:r>
+        <w:t>is loaded</w:t>
+      </w:r>
+      <w:r>
+        <w:t xml:space="preserve"> correctly and the model was able to perform its training. </w:t>
+      </w:r>
+      <w:r>
+        <w:t xml:space="preserve">Given that the price in the data set </w:t>
+      </w:r>
+      <w:r>
+        <w:t xml:space="preserve">is denominated in dollars it is </w:t>
       </w:r>
       <w:r>
         <w:lastRenderedPageBreak/>
-        <w:t xml:space="preserve">perform its training. </w:t>
-      </w:r>
-      <w:r>
-        <w:t xml:space="preserve">Given that the price in the data set </w:t>
-      </w:r>
-      <w:r>
-        <w:t xml:space="preserve">is denominated in dollars it is important to not stray too far from thinking about things in dollars. Looking at a raw number can distract too much from the dollar </w:t>
+        <w:t xml:space="preserve">important </w:t>
+      </w:r>
+      <w:r>
+        <w:t>not to</w:t>
+      </w:r>
+      <w:r>
+        <w:t xml:space="preserve"> stray too far from thinking about things in dollars. Looking at a raw number can distract too much from the dollar </w:t>
       </w:r>
       <w:r>
         <w:t xml:space="preserve">or cent </w:t>
@@ -1020,6 +2085,9 @@
       </w:r>
     </w:p>
     <w:p>
+      <w:pPr>
+        <w:spacing w:line="480" w:lineRule="auto"/>
+      </w:pPr>
       <w:r>
         <w:tab/>
         <w:t xml:space="preserve">After the features are loaded the script next moves on to </w:t>
@@ -1061,7 +2129,15 @@
         <w:t>,</w:t>
       </w:r>
       <w:r>
-        <w:t xml:space="preserve"> Root Mean Squared Error (RMSE) amounted to 0.1397. The RMSE is like the MAE </w:t>
+        <w:t xml:space="preserve"> Root Mean Squared Error (RMSE) amounted to 0.1397. The RMSE is like </w:t>
+      </w:r>
+      <w:proofErr w:type="gramStart"/>
+      <w:r>
+        <w:t>the MAE</w:t>
+      </w:r>
+      <w:proofErr w:type="gramEnd"/>
+      <w:r>
+        <w:t xml:space="preserve"> </w:t>
       </w:r>
       <w:r>
         <w:t>except</w:t>
@@ -1073,7 +2149,21 @@
         <w:t xml:space="preserve">square roots thus punishing larger differences more as they get bigger. That makes it more sensitive to large errors for a short time. </w:t>
       </w:r>
       <w:r>
-        <w:t xml:space="preserve">These numbers show the that the predictions are fairly accurate except for a few days where the predictions </w:t>
+        <w:t xml:space="preserve">These numbers show </w:t>
+      </w:r>
+      <w:proofErr w:type="gramStart"/>
+      <w:r>
+        <w:t>the that</w:t>
+      </w:r>
+      <w:proofErr w:type="gramEnd"/>
+      <w:r>
+        <w:t xml:space="preserve"> the predictions are fairly accurate except for a few days </w:t>
+      </w:r>
+      <w:r>
+        <w:t>when</w:t>
+      </w:r>
+      <w:r>
+        <w:t xml:space="preserve"> the predictions </w:t>
       </w:r>
       <w:r>
         <w:t>were</w:t>
@@ -1089,6 +2179,9 @@
       </w:r>
     </w:p>
     <w:p>
+      <w:pPr>
+        <w:spacing w:line="480" w:lineRule="auto"/>
+      </w:pPr>
       <w:r>
         <w:tab/>
       </w:r>
@@ -1099,7 +2192,7 @@
         <w:t xml:space="preserve">of the data and model being worked with. The graph also </w:t>
       </w:r>
       <w:r>
-        <w:t>collaborates</w:t>
+        <w:t>corroborates</w:t>
       </w:r>
       <w:r>
         <w:t xml:space="preserve"> the </w:t>
@@ -1108,7 +2201,15 @@
         <w:t>information</w:t>
       </w:r>
       <w:r>
-        <w:t xml:space="preserve"> that was printed to the terminal.</w:t>
+        <w:t xml:space="preserve"> that was printed </w:t>
+      </w:r>
+      <w:proofErr w:type="gramStart"/>
+      <w:r>
+        <w:t>to</w:t>
+      </w:r>
+      <w:proofErr w:type="gramEnd"/>
+      <w:r>
+        <w:t xml:space="preserve"> the terminal.</w:t>
       </w:r>
       <w:r>
         <w:t xml:space="preserve"> The chart shows two lines one represents the data in the data set. While the other one represents </w:t>
@@ -1117,13 +2218,39 @@
         <w:t xml:space="preserve">the prediction made by the model. It takes a glance to see how the two compare. </w:t>
       </w:r>
       <w:r>
-        <w:t xml:space="preserve">It is evident that the to correlate very closely. This shows that the model is able to generally predict the movement of the data. </w:t>
+        <w:t>It is evident that the</w:t>
+      </w:r>
+      <w:r>
+        <w:t>y</w:t>
+      </w:r>
+      <w:r>
+        <w:t xml:space="preserve"> </w:t>
+      </w:r>
+      <w:r>
+        <w:t>correlate</w:t>
+      </w:r>
+      <w:r>
+        <w:t xml:space="preserve"> very closely. This shows that the model </w:t>
+      </w:r>
+      <w:proofErr w:type="gramStart"/>
+      <w:r>
+        <w:t>is able to</w:t>
+      </w:r>
+      <w:proofErr w:type="gramEnd"/>
+      <w:r>
+        <w:t xml:space="preserve"> generally predict the movement of the data. </w:t>
       </w:r>
       <w:r>
         <w:t xml:space="preserve">One noticeable thing is that the line representing the prediction </w:t>
       </w:r>
       <w:r>
-        <w:t xml:space="preserve">is smoother than the actual data turned out to be this </w:t>
+        <w:t xml:space="preserve">is smoother than the actual data turned out to </w:t>
+      </w:r>
+      <w:r>
+        <w:t>be,</w:t>
+      </w:r>
+      <w:r>
+        <w:t xml:space="preserve"> this </w:t>
       </w:r>
       <w:r>
         <w:t>celebrates</w:t>
@@ -1132,42 +2259,62 @@
         <w:t xml:space="preserve"> the RMSE being higher than the </w:t>
       </w:r>
       <w:r>
-        <w:t xml:space="preserve">MAE. Lastly the script logs a next day prediction </w:t>
-      </w:r>
-      <w:r>
-        <w:t xml:space="preserve">to the terminal. This prediction comes form the most recent set of price history. </w:t>
-      </w:r>
-      <w:r>
-        <w:t xml:space="preserve">This is the models educated guess on what the price will be the day after the end of the data set. </w:t>
-      </w:r>
-      <w:r>
-        <w:t xml:space="preserve">It has a label saying tomorrows prediction on it making it clear what it is. </w:t>
-      </w:r>
-    </w:p>
-    <w:p/>
-    <w:p/>
-    <w:p/>
-    <w:p/>
-    <w:p/>
-    <w:p/>
-    <w:p/>
-    <w:p/>
-    <w:p/>
-    <w:p/>
-    <w:p/>
-    <w:p/>
-    <w:p/>
-    <w:p/>
-    <w:p/>
-    <w:p/>
-    <w:p/>
-    <w:p>
+        <w:t xml:space="preserve">MAE. Lastly the script logs </w:t>
+      </w:r>
+      <w:proofErr w:type="gramStart"/>
+      <w:r>
+        <w:t>a next day</w:t>
+      </w:r>
+      <w:proofErr w:type="gramEnd"/>
+      <w:r>
+        <w:t xml:space="preserve"> prediction </w:t>
+      </w:r>
+      <w:r>
+        <w:t xml:space="preserve">to the terminal. This prediction comes </w:t>
+      </w:r>
+      <w:r>
+        <w:t>from</w:t>
+      </w:r>
+      <w:r>
+        <w:t xml:space="preserve"> the most recent set of price history. </w:t>
+      </w:r>
+      <w:r>
+        <w:t xml:space="preserve">This is the </w:t>
+      </w:r>
+      <w:r>
+        <w:lastRenderedPageBreak/>
+        <w:t xml:space="preserve">models educated guess on what the price will be the day after the end of the data set. </w:t>
+      </w:r>
+      <w:r>
+        <w:t xml:space="preserve">It has a label saying </w:t>
+      </w:r>
+      <w:r>
+        <w:t>tomorrow’s</w:t>
+      </w:r>
+      <w:r>
+        <w:t xml:space="preserve"> prediction on it making it clear what it is. </w:t>
+      </w:r>
+    </w:p>
+    <w:p>
+      <w:pPr>
+        <w:spacing w:line="480" w:lineRule="auto"/>
+      </w:pPr>
+    </w:p>
+    <w:p>
+      <w:pPr>
+        <w:spacing w:line="480" w:lineRule="auto"/>
+      </w:pPr>
+    </w:p>
+    <w:p>
+      <w:pPr>
+        <w:spacing w:line="480" w:lineRule="auto"/>
+      </w:pPr>
       <w:r>
         <w:rPr>
           <w:noProof/>
         </w:rPr>
         <w:drawing>
-          <wp:inline distT="0" distB="0" distL="0" distR="0" wp14:anchorId="21C6E729" wp14:editId="0E21FF55">
+          <wp:inline distT="0" distB="0" distL="0" distR="0" wp14:anchorId="76335FCB" wp14:editId="00A18DCA">
             <wp:extent cx="5943600" cy="3798570"/>
             <wp:effectExtent l="0" t="0" r="0" b="0"/>
             <wp:docPr id="1895883056" name="Picture 1"/>
@@ -1182,7 +2329,7 @@
                     <pic:cNvPicPr/>
                   </pic:nvPicPr>
                   <pic:blipFill>
-                    <a:blip r:embed="rId6">
+                    <a:blip r:embed="rId8">
                       <a:extLst>
                         <a:ext uri="{28A0092B-C50C-407E-A947-70E740481C1C}">
                           <a14:useLocalDpi xmlns:a14="http://schemas.microsoft.com/office/drawing/2010/main" val="0"/>
@@ -1209,13 +2356,44 @@
         </w:drawing>
       </w:r>
     </w:p>
-    <w:p/>
-    <w:p>
-      <w:r>
+    <w:p>
+      <w:pPr>
+        <w:spacing w:line="480" w:lineRule="auto"/>
+      </w:pPr>
+    </w:p>
+    <w:p>
+      <w:pPr>
+        <w:spacing w:line="480" w:lineRule="auto"/>
+      </w:pPr>
+    </w:p>
+    <w:p>
+      <w:pPr>
+        <w:spacing w:line="480" w:lineRule="auto"/>
+      </w:pPr>
+    </w:p>
+    <w:p>
+      <w:pPr>
+        <w:spacing w:line="480" w:lineRule="auto"/>
+      </w:pPr>
+    </w:p>
+    <w:p>
+      <w:pPr>
+        <w:spacing w:line="480" w:lineRule="auto"/>
+      </w:pPr>
+    </w:p>
+    <w:p>
+      <w:pPr>
+        <w:spacing w:line="480" w:lineRule="auto"/>
+      </w:pPr>
+      <w:r>
+        <w:lastRenderedPageBreak/>
         <w:t xml:space="preserve">Insights </w:t>
       </w:r>
     </w:p>
     <w:p>
+      <w:pPr>
+        <w:spacing w:line="480" w:lineRule="auto"/>
+      </w:pPr>
       <w:r>
         <w:tab/>
         <w:t xml:space="preserve">The Random Forest model was able to track the data quite closely. The MAE </w:t>
@@ -1242,7 +2420,15 @@
         <w:t xml:space="preserve"> Root Mean Squared Error (RMSE) </w:t>
       </w:r>
       <w:r>
-        <w:t xml:space="preserve">was 0.1397. RMSE is like the MAE but it </w:t>
+        <w:t xml:space="preserve">was 0.1397. RMSE is like the </w:t>
+      </w:r>
+      <w:proofErr w:type="gramStart"/>
+      <w:r>
+        <w:t>MAE</w:t>
+      </w:r>
+      <w:proofErr w:type="gramEnd"/>
+      <w:r>
+        <w:t xml:space="preserve"> but it </w:t>
       </w:r>
       <w:r>
         <w:t xml:space="preserve">penalizes larger errors more because it uses square roots. </w:t>
@@ -1257,11 +2443,7 @@
         <w:t xml:space="preserve"> The MAE being approximately 0.08 means that the price prediction stayed around </w:t>
       </w:r>
       <w:r>
-        <w:t xml:space="preserve">8 </w:t>
-      </w:r>
-      <w:r>
-        <w:lastRenderedPageBreak/>
-        <w:t>cents from what the price ended up being. This is small compared to the total price range.</w:t>
+        <w:t>8 cents from what the price ended up being. This is small compared to the total price range.</w:t>
       </w:r>
       <w:r>
         <w:t xml:space="preserve"> The RMSE ended up being larger because it </w:t>
@@ -1276,7 +2458,13 @@
         <w:t xml:space="preserve">errors. This would suggest that the model </w:t>
       </w:r>
       <w:r>
-        <w:t xml:space="preserve">is inaccurate for short periods of time probably around the spiking price changes </w:t>
+        <w:t xml:space="preserve">is inaccurate for short periods of </w:t>
+      </w:r>
+      <w:r>
+        <w:t>time,</w:t>
+      </w:r>
+      <w:r>
+        <w:t xml:space="preserve"> probably around the spiking price changes </w:t>
       </w:r>
       <w:r>
         <w:t>where</w:t>
@@ -1294,10 +2482,21 @@
         <w:t xml:space="preserve">This can be verified by looking at the chart. </w:t>
       </w:r>
       <w:r>
-        <w:t xml:space="preserve">The price is harder for it to predict around rapid changes using short term history. </w:t>
-      </w:r>
-    </w:p>
-    <w:p>
+        <w:t xml:space="preserve">The price is harder for it to </w:t>
+      </w:r>
+      <w:proofErr w:type="gramStart"/>
+      <w:r>
+        <w:t>predict around</w:t>
+      </w:r>
+      <w:proofErr w:type="gramEnd"/>
+      <w:r>
+        <w:t xml:space="preserve"> rapid changes using short term history. </w:t>
+      </w:r>
+    </w:p>
+    <w:p>
+      <w:pPr>
+        <w:spacing w:line="480" w:lineRule="auto"/>
+      </w:pPr>
       <w:r>
         <w:tab/>
         <w:t xml:space="preserve">There are a few limitations that jump out about this project. </w:t>
@@ -1341,11 +2540,16 @@
       <w:r>
         <w:t xml:space="preserve">These special algorithms </w:t>
       </w:r>
+      <w:proofErr w:type="gramStart"/>
       <w:r>
         <w:t>actually</w:t>
       </w:r>
       <w:r>
-        <w:t xml:space="preserve"> have the ability to store patterns that can be directly </w:t>
+        <w:t xml:space="preserve"> have</w:t>
+      </w:r>
+      <w:proofErr w:type="gramEnd"/>
+      <w:r>
+        <w:t xml:space="preserve"> the ability to store patterns that can be directly </w:t>
       </w:r>
       <w:r>
         <w:t xml:space="preserve">found when they are repeated. An example of a more optimized algorithm would be Long </w:t>
@@ -1357,13 +2561,23 @@
         <w:t xml:space="preserve"> Memory (LSTM)</w:t>
       </w:r>
       <w:r>
-        <w:t xml:space="preserve">. AS is evident by the name it has memory which allows that algorithm to memorize patterns and predict them if they come back </w:t>
+        <w:t xml:space="preserve">. AS is evident by the </w:t>
+      </w:r>
+      <w:r>
+        <w:lastRenderedPageBreak/>
+        <w:t xml:space="preserve">name it has memory which allows that algorithm to memorize patterns and predict them if they come back </w:t>
       </w:r>
       <w:r>
         <w:t xml:space="preserve">cyclically. </w:t>
       </w:r>
       <w:r>
-        <w:t xml:space="preserve">Finaly, </w:t>
+        <w:t>Final</w:t>
+      </w:r>
+      <w:r>
+        <w:t>l</w:t>
+      </w:r>
+      <w:r>
+        <w:t xml:space="preserve">y, </w:t>
       </w:r>
       <w:r>
         <w:t xml:space="preserve">the hyperparameters used in training </w:t>
@@ -1375,7 +2589,13 @@
         <w:t xml:space="preserve"> default except for the number of trees. </w:t>
       </w:r>
       <w:r>
-        <w:t xml:space="preserve">Hyperparameters are the nobs for training a model so more tuning of them can result in a better trained model. </w:t>
+        <w:t xml:space="preserve">Hyperparameters are the </w:t>
+      </w:r>
+      <w:r>
+        <w:t>k</w:t>
+      </w:r>
+      <w:r>
+        <w:t xml:space="preserve">nobs for training a model so more tuning of them can result in a better trained model. </w:t>
       </w:r>
       <w:r>
         <w:t xml:space="preserve">Good examples of </w:t>
@@ -1442,6 +2662,9 @@
       </w:r>
     </w:p>
     <w:p>
+      <w:pPr>
+        <w:spacing w:line="480" w:lineRule="auto"/>
+      </w:pPr>
       <w:r>
         <w:tab/>
         <w:t xml:space="preserve">There are a few obvious steps that could be taken to </w:t>
@@ -1459,7 +2682,23 @@
         <w:t>.</w:t>
       </w:r>
       <w:r>
-        <w:t xml:space="preserve"> Momentum features in particular would help the model with its weak point of the price rapidly changing direction.</w:t>
+        <w:t xml:space="preserve"> Momentum features </w:t>
+      </w:r>
+      <w:proofErr w:type="gramStart"/>
+      <w:r>
+        <w:t>in particular would</w:t>
+      </w:r>
+      <w:proofErr w:type="gramEnd"/>
+      <w:r>
+        <w:t xml:space="preserve"> help the model with its weak point </w:t>
+      </w:r>
+      <w:proofErr w:type="gramStart"/>
+      <w:r>
+        <w:t>of</w:t>
+      </w:r>
+      <w:proofErr w:type="gramEnd"/>
+      <w:r>
+        <w:t xml:space="preserve"> the price rapidly changing direction.</w:t>
       </w:r>
       <w:r>
         <w:t xml:space="preserve"> A very powerful improvement would be adding more pieces of price information. An example of price related data would be sales volume. </w:t>
@@ -1471,7 +2710,15 @@
         <w:t>dimension</w:t>
       </w:r>
       <w:r>
-        <w:t xml:space="preserve"> to the model unfortunately this data set </w:t>
+        <w:t xml:space="preserve"> to the </w:t>
+      </w:r>
+      <w:proofErr w:type="gramStart"/>
+      <w:r>
+        <w:t>model</w:t>
+      </w:r>
+      <w:proofErr w:type="gramEnd"/>
+      <w:r>
+        <w:t xml:space="preserve"> unfortunately this data set </w:t>
       </w:r>
       <w:r>
         <w:t>does</w:t>
@@ -1520,16 +2767,17 @@
         <w:t xml:space="preserve">. Training and comparing all of these would be fun and interesting but would be quite a large project. </w:t>
       </w:r>
     </w:p>
-    <w:p/>
-    <w:p/>
-    <w:p/>
-    <w:p/>
-    <w:p/>
-    <w:p/>
-    <w:p/>
-    <w:p/>
-    <w:p>
-      <w:r>
+    <w:p>
+      <w:pPr>
+        <w:spacing w:line="480" w:lineRule="auto"/>
+      </w:pPr>
+    </w:p>
+    <w:p>
+      <w:pPr>
+        <w:spacing w:line="480" w:lineRule="auto"/>
+      </w:pPr>
+      <w:r>
+        <w:lastRenderedPageBreak/>
         <w:t xml:space="preserve">References </w:t>
       </w:r>
     </w:p>
@@ -1553,7 +2801,7 @@
       <w:r>
         <w:t xml:space="preserve"> [Data set]. Kaggle. </w:t>
       </w:r>
-      <w:hyperlink r:id="rId7" w:history="1">
+      <w:hyperlink r:id="rId9" w:history="1">
         <w:r>
           <w:rPr>
             <w:rStyle w:val="Hyperlink"/>
@@ -1562,6 +2810,7 @@
         </w:r>
       </w:hyperlink>
     </w:p>
+    <w:p/>
     <w:p>
       <w:r>
         <w:t>Matplotlib developers. (n.d.). Matplotlib documentation. Retrieved February 28, 2026, from https://matplotlib.org</w:t>
@@ -1569,8 +2818,21 @@
     </w:p>
     <w:p/>
     <w:p>
-      <w:r>
-        <w:t>pandas development team. (n.d.). pandas documentation. Retrieved February 28, 2026, from https://pandas.pydata.org</w:t>
+      <w:proofErr w:type="gramStart"/>
+      <w:r>
+        <w:t>pandas</w:t>
+      </w:r>
+      <w:proofErr w:type="gramEnd"/>
+      <w:r>
+        <w:t xml:space="preserve"> development team. (n.d.). </w:t>
+      </w:r>
+      <w:proofErr w:type="gramStart"/>
+      <w:r>
+        <w:t>pandas</w:t>
+      </w:r>
+      <w:proofErr w:type="gramEnd"/>
+      <w:r>
+        <w:t xml:space="preserve"> documentation. Retrieved February 28, 2026, from https://pandas.pydata.org</w:t>
       </w:r>
     </w:p>
     <w:p/>
@@ -1579,6 +2841,74 @@
         <w:t>scikit-learn developers. (n.d.). scikit-learn documentation. Retrieved February 28, 2026, from https://scikit-learn.org</w:t>
       </w:r>
     </w:p>
+    <w:p/>
+    <w:p>
+      <w:proofErr w:type="spellStart"/>
+      <w:r>
+        <w:t>Ntokos</w:t>
+      </w:r>
+      <w:proofErr w:type="spellEnd"/>
+      <w:r>
+        <w:t xml:space="preserve">, A. (n.d.). </w:t>
+      </w:r>
+      <w:r>
+        <w:rPr>
+          <w:i/>
+          <w:iCs/>
+        </w:rPr>
+        <w:t>Supervised learning in machine learning</w:t>
+      </w:r>
+      <w:r>
+        <w:t xml:space="preserve">. Study.com. </w:t>
+      </w:r>
+      <w:hyperlink r:id="rId10" w:history="1">
+        <w:r>
+          <w:rPr>
+            <w:rStyle w:val="Hyperlink"/>
+          </w:rPr>
+          <w:t>https://study.com/academy/lesson/supervised-learning-in-machine-learning.html</w:t>
+        </w:r>
+      </w:hyperlink>
+    </w:p>
+    <w:p/>
+    <w:p>
+      <w:r>
+        <w:t xml:space="preserve">Perkins, S. (n.d.). </w:t>
+      </w:r>
+      <w:r>
+        <w:rPr>
+          <w:i/>
+          <w:iCs/>
+        </w:rPr>
+        <w:t>Neural networks in machine learning: Uses &amp; examples</w:t>
+      </w:r>
+      <w:r>
+        <w:t>. Study.com. https://study.com/academy/lesson/neural-networks-in-machine-learning-uses-examples.html</w:t>
+      </w:r>
+    </w:p>
+    <w:p/>
+    <w:p>
+      <w:proofErr w:type="spellStart"/>
+      <w:r>
+        <w:t>Breiman</w:t>
+      </w:r>
+      <w:proofErr w:type="spellEnd"/>
+      <w:r>
+        <w:t xml:space="preserve">, L. (2001). Random forests. </w:t>
+      </w:r>
+      <w:r>
+        <w:rPr>
+          <w:i/>
+          <w:iCs/>
+        </w:rPr>
+        <w:t>Machine Learning, 45</w:t>
+      </w:r>
+      <w:r>
+        <w:t>(1), 5–32. https://doi.org/10.1023/A:1010933404324</w:t>
+      </w:r>
+    </w:p>
+    <w:p/>
+    <w:p/>
     <w:sectPr>
       <w:pgSz w:w="12240" w:h="15840"/>
       <w:pgMar w:top="1440" w:right="1440" w:bottom="1440" w:left="1440" w:header="720" w:footer="720" w:gutter="0"/>
@@ -1587,6 +2917,56 @@
     </w:sectPr>
   </w:body>
 </w:document>
+</file>
+
+<file path=word/endnotes.xml><?xml version="1.0" encoding="utf-8"?>
+<w:endnotes xmlns:wpc="http://schemas.microsoft.com/office/word/2010/wordprocessingCanvas" xmlns:cx="http://schemas.microsoft.com/office/drawing/2014/chartex" xmlns:cx1="http://schemas.microsoft.com/office/drawing/2015/9/8/chartex" xmlns:cx2="http://schemas.microsoft.com/office/drawing/2015/10/21/chartex" xmlns:cx3="http://schemas.microsoft.com/office/drawing/2016/5/9/chartex" xmlns:cx4="http://schemas.microsoft.com/office/drawing/2016/5/10/chartex" xmlns:cx5="http://schemas.microsoft.com/office/drawing/2016/5/11/chartex" xmlns:cx6="http://schemas.microsoft.com/office/drawing/2016/5/12/chartex" xmlns:cx7="http://schemas.microsoft.com/office/drawing/2016/5/13/chartex" xmlns:cx8="http://schemas.microsoft.com/office/drawing/2016/5/14/chartex" xmlns:mc="http://schemas.openxmlformats.org/markup-compatibility/2006" xmlns:aink="http://schemas.microsoft.com/office/drawing/2016/ink" xmlns:am3d="http://schemas.microsoft.com/office/drawing/2017/model3d" xmlns:o="urn:schemas-microsoft-com:office:office" xmlns:oel="http://schemas.microsoft.com/office/2019/extlst" xmlns:r="http://schemas.openxmlformats.org/officeDocument/2006/relationships" xmlns:m="http://schemas.openxmlformats.org/officeDocument/2006/math" xmlns:v="urn:schemas-microsoft-com:vml" xmlns:wp14="http://schemas.microsoft.com/office/word/2010/wordprocessingDrawing" xmlns:wp="http://schemas.openxmlformats.org/drawingml/2006/wordprocessingDrawing" xmlns:w10="urn:schemas-microsoft-com:office:word" xmlns:w="http://schemas.openxmlformats.org/wordprocessingml/2006/main" xmlns:w14="http://schemas.microsoft.com/office/word/2010/wordml" xmlns:w15="http://schemas.microsoft.com/office/word/2012/wordml" xmlns:w16cex="http://schemas.microsoft.com/office/word/2018/wordml/cex" xmlns:w16cid="http://schemas.microsoft.com/office/word/2016/wordml/cid" xmlns:w16="http://schemas.microsoft.com/office/word/2018/wordml" xmlns:w16du="http://schemas.microsoft.com/office/word/2023/wordml/word16du" xmlns:w16sdtdh="http://schemas.microsoft.com/office/word/2020/wordml/sdtdatahash" xmlns:w16sdtfl="http://schemas.microsoft.com/office/word/2024/wordml/sdtformatlock" xmlns:w16se="http://schemas.microsoft.com/office/word/2015/wordml/symex" xmlns:wpg="http://schemas.microsoft.com/office/word/2010/wordprocessingGroup" xmlns:wpi="http://schemas.microsoft.com/office/word/2010/wordprocessingInk" xmlns:wne="http://schemas.microsoft.com/office/word/2006/wordml" xmlns:wps="http://schemas.microsoft.com/office/word/2010/wordprocessingShape" mc:Ignorable="w14 w15 w16se w16cid w16 w16cex w16sdtdh w16sdtfl w16du wp14">
+  <w:endnote w:type="separator" w:id="-1">
+    <w:p>
+      <w:pPr>
+        <w:spacing w:after="0" w:line="240" w:lineRule="auto"/>
+      </w:pPr>
+      <w:r>
+        <w:separator/>
+      </w:r>
+    </w:p>
+  </w:endnote>
+  <w:endnote w:type="continuationSeparator" w:id="0">
+    <w:p>
+      <w:pPr>
+        <w:spacing w:after="0" w:line="240" w:lineRule="auto"/>
+      </w:pPr>
+      <w:r>
+        <w:continuationSeparator/>
+      </w:r>
+    </w:p>
+  </w:endnote>
+</w:endnotes>
+</file>
+
+<file path=word/footnotes.xml><?xml version="1.0" encoding="utf-8"?>
+<w:footnotes xmlns:wpc="http://schemas.microsoft.com/office/word/2010/wordprocessingCanvas" xmlns:cx="http://schemas.microsoft.com/office/drawing/2014/chartex" xmlns:cx1="http://schemas.microsoft.com/office/drawing/2015/9/8/chartex" xmlns:cx2="http://schemas.microsoft.com/office/drawing/2015/10/21/chartex" xmlns:cx3="http://schemas.microsoft.com/office/drawing/2016/5/9/chartex" xmlns:cx4="http://schemas.microsoft.com/office/drawing/2016/5/10/chartex" xmlns:cx5="http://schemas.microsoft.com/office/drawing/2016/5/11/chartex" xmlns:cx6="http://schemas.microsoft.com/office/drawing/2016/5/12/chartex" xmlns:cx7="http://schemas.microsoft.com/office/drawing/2016/5/13/chartex" xmlns:cx8="http://schemas.microsoft.com/office/drawing/2016/5/14/chartex" xmlns:mc="http://schemas.openxmlformats.org/markup-compatibility/2006" xmlns:aink="http://schemas.microsoft.com/office/drawing/2016/ink" xmlns:am3d="http://schemas.microsoft.com/office/drawing/2017/model3d" xmlns:o="urn:schemas-microsoft-com:office:office" xmlns:oel="http://schemas.microsoft.com/office/2019/extlst" xmlns:r="http://schemas.openxmlformats.org/officeDocument/2006/relationships" xmlns:m="http://schemas.openxmlformats.org/officeDocument/2006/math" xmlns:v="urn:schemas-microsoft-com:vml" xmlns:wp14="http://schemas.microsoft.com/office/word/2010/wordprocessingDrawing" xmlns:wp="http://schemas.openxmlformats.org/drawingml/2006/wordprocessingDrawing" xmlns:w10="urn:schemas-microsoft-com:office:word" xmlns:w="http://schemas.openxmlformats.org/wordprocessingml/2006/main" xmlns:w14="http://schemas.microsoft.com/office/word/2010/wordml" xmlns:w15="http://schemas.microsoft.com/office/word/2012/wordml" xmlns:w16cex="http://schemas.microsoft.com/office/word/2018/wordml/cex" xmlns:w16cid="http://schemas.microsoft.com/office/word/2016/wordml/cid" xmlns:w16="http://schemas.microsoft.com/office/word/2018/wordml" xmlns:w16du="http://schemas.microsoft.com/office/word/2023/wordml/word16du" xmlns:w16sdtdh="http://schemas.microsoft.com/office/word/2020/wordml/sdtdatahash" xmlns:w16sdtfl="http://schemas.microsoft.com/office/word/2024/wordml/sdtformatlock" xmlns:w16se="http://schemas.microsoft.com/office/word/2015/wordml/symex" xmlns:wpg="http://schemas.microsoft.com/office/word/2010/wordprocessingGroup" xmlns:wpi="http://schemas.microsoft.com/office/word/2010/wordprocessingInk" xmlns:wne="http://schemas.microsoft.com/office/word/2006/wordml" xmlns:wps="http://schemas.microsoft.com/office/word/2010/wordprocessingShape" mc:Ignorable="w14 w15 w16se w16cid w16 w16cex w16sdtdh w16sdtfl w16du wp14">
+  <w:footnote w:type="separator" w:id="-1">
+    <w:p>
+      <w:pPr>
+        <w:spacing w:after="0" w:line="240" w:lineRule="auto"/>
+      </w:pPr>
+      <w:r>
+        <w:separator/>
+      </w:r>
+    </w:p>
+  </w:footnote>
+  <w:footnote w:type="continuationSeparator" w:id="0">
+    <w:p>
+      <w:pPr>
+        <w:spacing w:after="0" w:line="240" w:lineRule="auto"/>
+      </w:pPr>
+      <w:r>
+        <w:continuationSeparator/>
+      </w:r>
+    </w:p>
+  </w:footnote>
+</w:footnotes>
 </file>
 
 <file path=word/numbering.xml><?xml version="1.0" encoding="utf-8"?>
@@ -3718,7 +5098,6 @@
   <w:style w:type="character" w:default="1" w:styleId="DefaultParagraphFont">
     <w:name w:val="Default Paragraph Font"/>
     <w:uiPriority w:val="1"/>
-    <w:semiHidden/>
     <w:unhideWhenUsed/>
   </w:style>
   <w:style w:type="table" w:default="1" w:styleId="TableNormal">
@@ -4066,6 +5445,69 @@
       <w:shd w:val="clear" w:color="auto" w:fill="E1DFDD"/>
     </w:rPr>
   </w:style>
+  <w:style w:type="paragraph" w:styleId="Header">
+    <w:name w:val="header"/>
+    <w:basedOn w:val="Normal"/>
+    <w:link w:val="HeaderChar"/>
+    <w:uiPriority w:val="99"/>
+    <w:unhideWhenUsed/>
+    <w:rsid w:val="00CA6AD0"/>
+    <w:pPr>
+      <w:tabs>
+        <w:tab w:val="center" w:pos="4680"/>
+        <w:tab w:val="right" w:pos="9360"/>
+      </w:tabs>
+      <w:spacing w:after="0" w:line="240" w:lineRule="auto"/>
+    </w:pPr>
+  </w:style>
+  <w:style w:type="character" w:customStyle="1" w:styleId="HeaderChar">
+    <w:name w:val="Header Char"/>
+    <w:basedOn w:val="DefaultParagraphFont"/>
+    <w:link w:val="Header"/>
+    <w:uiPriority w:val="99"/>
+    <w:rsid w:val="00CA6AD0"/>
+  </w:style>
+  <w:style w:type="paragraph" w:styleId="Footer">
+    <w:name w:val="footer"/>
+    <w:basedOn w:val="Normal"/>
+    <w:link w:val="FooterChar"/>
+    <w:uiPriority w:val="99"/>
+    <w:unhideWhenUsed/>
+    <w:rsid w:val="00CA6AD0"/>
+    <w:pPr>
+      <w:tabs>
+        <w:tab w:val="center" w:pos="4680"/>
+        <w:tab w:val="right" w:pos="9360"/>
+      </w:tabs>
+      <w:spacing w:after="0" w:line="240" w:lineRule="auto"/>
+    </w:pPr>
+  </w:style>
+  <w:style w:type="character" w:customStyle="1" w:styleId="FooterChar">
+    <w:name w:val="Footer Char"/>
+    <w:basedOn w:val="DefaultParagraphFont"/>
+    <w:link w:val="Footer"/>
+    <w:uiPriority w:val="99"/>
+    <w:rsid w:val="00CA6AD0"/>
+  </w:style>
+  <w:style w:type="table" w:styleId="TableGrid">
+    <w:name w:val="Table Grid"/>
+    <w:basedOn w:val="TableNormal"/>
+    <w:uiPriority w:val="39"/>
+    <w:rsid w:val="00597572"/>
+    <w:pPr>
+      <w:spacing w:after="0" w:line="240" w:lineRule="auto"/>
+    </w:pPr>
+    <w:tblPr>
+      <w:tblBorders>
+        <w:top w:val="single" w:sz="4" w:space="0" w:color="auto"/>
+        <w:left w:val="single" w:sz="4" w:space="0" w:color="auto"/>
+        <w:bottom w:val="single" w:sz="4" w:space="0" w:color="auto"/>
+        <w:right w:val="single" w:sz="4" w:space="0" w:color="auto"/>
+        <w:insideH w:val="single" w:sz="4" w:space="0" w:color="auto"/>
+        <w:insideV w:val="single" w:sz="4" w:space="0" w:color="auto"/>
+      </w:tblBorders>
+    </w:tblPr>
+  </w:style>
 </w:styles>
 </file>
 

</xml_diff>